<commit_message>
OOP:lab4-8 rework started, some lab texts added, code refactored
</commit_message>
<xml_diff>
--- a/OOP/Lab texts/6_WPF_ресурсы_стили_триггеры.docx
+++ b/OOP/Lab texts/6_WPF_ресурсы_стили_триггеры.docx
@@ -49,7 +49,7 @@
           <w:rFonts w:eastAsia="Times New Roman"/>
           <w:b/>
           <w:color w:val="000000" w:themeColor="text1"/>
-          <w:lang w:eastAsia="ru-RU"/>
+          <w:lang w:val="en-US" w:eastAsia="ru-RU"/>
           <w14:shadow w14:blurRad="38100" w14:dist="19050" w14:dir="2700000" w14:sx="100000" w14:sy="100000" w14:kx="0" w14:ky="0" w14:algn="tl">
             <w14:schemeClr w14:val="dk1">
               <w14:alpha w14:val="60000"/>
@@ -61,7 +61,7 @@
             <w14:round/>
           </w14:textOutline>
         </w:rPr>
-        <w:t>8</w:t>
+        <w:t xml:space="preserve">6 </w:t>
       </w:r>
       <w:r>
         <w:rPr>
@@ -80,7 +80,7 @@
             <w14:round/>
           </w14:textOutline>
         </w:rPr>
-        <w:t xml:space="preserve"> </w:t>
+        <w:t>Ресурсы, стили, триггеры</w:t>
       </w:r>
       <w:r>
         <w:rPr>
@@ -99,7 +99,7 @@
             <w14:round/>
           </w14:textOutline>
         </w:rPr>
-        <w:t>Ресурсы, стили, триггеры</w:t>
+        <w:t>, шаблоны</w:t>
       </w:r>
       <w:r>
         <w:rPr>
@@ -118,25 +118,6 @@
             <w14:round/>
           </w14:textOutline>
         </w:rPr>
-        <w:t>, шаблоны</w:t>
-      </w:r>
-      <w:r>
-        <w:rPr>
-          <w:rFonts w:eastAsia="Times New Roman"/>
-          <w:b/>
-          <w:color w:val="000000" w:themeColor="text1"/>
-          <w:lang w:eastAsia="ru-RU"/>
-          <w14:shadow w14:blurRad="38100" w14:dist="19050" w14:dir="2700000" w14:sx="100000" w14:sy="100000" w14:kx="0" w14:ky="0" w14:algn="tl">
-            <w14:schemeClr w14:val="dk1">
-              <w14:alpha w14:val="60000"/>
-            </w14:schemeClr>
-          </w14:shadow>
-          <w14:textOutline w14:w="0" w14:cap="flat" w14:cmpd="sng" w14:algn="ctr">
-            <w14:noFill/>
-            <w14:prstDash w14:val="solid"/>
-            <w14:round/>
-          </w14:textOutline>
-        </w:rPr>
         <w:t xml:space="preserve"> </w:t>
       </w:r>
       <w:bookmarkEnd w:id="0"/>
@@ -276,7 +257,6 @@
         </w:rPr>
         <w:t xml:space="preserve">Создайте </w:t>
       </w:r>
-      <w:proofErr w:type="spellStart"/>
       <w:r>
         <w:rPr>
           <w:b/>
@@ -287,7 +267,6 @@
         </w:rPr>
         <w:t>MultiTrigger</w:t>
       </w:r>
-      <w:proofErr w:type="spellEnd"/>
       <w:r>
         <w:rPr>
           <w:color w:val="000000"/>
@@ -330,7 +309,6 @@
         </w:rPr>
         <w:t xml:space="preserve">р данных </w:t>
       </w:r>
-      <w:proofErr w:type="spellStart"/>
       <w:r>
         <w:rPr>
           <w:b/>
@@ -340,7 +318,6 @@
         </w:rPr>
         <w:t>DataTrigger</w:t>
       </w:r>
-      <w:proofErr w:type="spellEnd"/>
       <w:r>
         <w:rPr>
           <w:color w:val="000000"/>
@@ -349,7 +326,6 @@
         </w:rPr>
         <w:t xml:space="preserve"> и триггер события </w:t>
       </w:r>
-      <w:proofErr w:type="spellStart"/>
       <w:r>
         <w:rPr>
           <w:b/>
@@ -359,7 +335,6 @@
         </w:rPr>
         <w:t>EventTrigger</w:t>
       </w:r>
-      <w:proofErr w:type="spellEnd"/>
       <w:r>
         <w:rPr>
           <w:color w:val="000000"/>
@@ -759,25 +734,7 @@
           <w:sz w:val="28"/>
           <w:szCs w:val="28"/>
         </w:rPr>
-        <w:t xml:space="preserve">Для чего в WPF используются ресурсы? Каким образом можно определить новый ресурс и управлять им? Опишите назначение класса </w:t>
-      </w:r>
-      <w:proofErr w:type="spellStart"/>
-      <w:r>
-        <w:rPr>
-          <w:color w:val="000000"/>
-          <w:sz w:val="28"/>
-          <w:szCs w:val="28"/>
-        </w:rPr>
-        <w:t>ResourceDictionary</w:t>
-      </w:r>
-      <w:proofErr w:type="spellEnd"/>
-      <w:r>
-        <w:rPr>
-          <w:color w:val="000000"/>
-          <w:sz w:val="28"/>
-          <w:szCs w:val="28"/>
-        </w:rPr>
-        <w:t>. Зачем каждый элемент имеет собственную коллекцию ресурсов?</w:t>
+        <w:t>Для чего в WPF используются ресурсы? Каким образом можно определить новый ресурс и управлять им? Опишите назначение класса ResourceDictionary. Зачем каждый элемент имеет собственную коллекцию ресурсов?</w:t>
       </w:r>
     </w:p>
     <w:p>
@@ -827,25 +784,7 @@
           <w:sz w:val="28"/>
           <w:szCs w:val="28"/>
         </w:rPr>
-        <w:t xml:space="preserve">Что такое </w:t>
-      </w:r>
-      <w:proofErr w:type="gramStart"/>
-      <w:r>
-        <w:rPr>
-          <w:color w:val="000000"/>
-          <w:sz w:val="28"/>
-          <w:szCs w:val="28"/>
-        </w:rPr>
-        <w:t>триггеры ?</w:t>
-      </w:r>
-      <w:proofErr w:type="gramEnd"/>
-      <w:r>
-        <w:rPr>
-          <w:color w:val="000000"/>
-          <w:sz w:val="28"/>
-          <w:szCs w:val="28"/>
-        </w:rPr>
-        <w:t xml:space="preserve"> </w:t>
+        <w:t xml:space="preserve">Что такое триггеры ? </w:t>
       </w:r>
       <w:r>
         <w:rPr>
@@ -1004,25 +943,7 @@
           <w:sz w:val="28"/>
           <w:szCs w:val="28"/>
         </w:rPr>
-        <w:t xml:space="preserve">Зачем нужны пользовательские элементы управления? Как создать собственный элемент. Опишите члены класса </w:t>
-      </w:r>
-      <w:proofErr w:type="spellStart"/>
-      <w:r>
-        <w:rPr>
-          <w:color w:val="000000"/>
-          <w:sz w:val="28"/>
-          <w:szCs w:val="28"/>
-        </w:rPr>
-        <w:t>UserControl</w:t>
-      </w:r>
-      <w:proofErr w:type="spellEnd"/>
-      <w:r>
-        <w:rPr>
-          <w:color w:val="000000"/>
-          <w:sz w:val="28"/>
-          <w:szCs w:val="28"/>
-        </w:rPr>
-        <w:t>.</w:t>
+        <w:t>Зачем нужны пользовательские элементы управления? Как создать собственный элемент. Опишите члены класса UserControl.</w:t>
       </w:r>
     </w:p>
     <w:p>
@@ -1047,61 +968,7 @@
           <w:sz w:val="28"/>
           <w:szCs w:val="28"/>
         </w:rPr>
-        <w:t xml:space="preserve">Что такое привязка данных? В чем разница между следующими режимами привязки: </w:t>
-      </w:r>
-      <w:proofErr w:type="spellStart"/>
-      <w:r>
-        <w:rPr>
-          <w:color w:val="000000"/>
-          <w:sz w:val="28"/>
-          <w:szCs w:val="28"/>
-        </w:rPr>
-        <w:t>OneWay</w:t>
-      </w:r>
-      <w:proofErr w:type="spellEnd"/>
-      <w:r>
-        <w:rPr>
-          <w:color w:val="000000"/>
-          <w:sz w:val="28"/>
-          <w:szCs w:val="28"/>
-        </w:rPr>
-        <w:t xml:space="preserve">, </w:t>
-      </w:r>
-      <w:proofErr w:type="spellStart"/>
-      <w:r>
-        <w:rPr>
-          <w:color w:val="000000"/>
-          <w:sz w:val="28"/>
-          <w:szCs w:val="28"/>
-        </w:rPr>
-        <w:t>TwoWay</w:t>
-      </w:r>
-      <w:proofErr w:type="spellEnd"/>
-      <w:r>
-        <w:rPr>
-          <w:color w:val="000000"/>
-          <w:sz w:val="28"/>
-          <w:szCs w:val="28"/>
-        </w:rPr>
-        <w:t xml:space="preserve"> и </w:t>
-      </w:r>
-      <w:proofErr w:type="spellStart"/>
-      <w:r>
-        <w:rPr>
-          <w:color w:val="000000"/>
-          <w:sz w:val="28"/>
-          <w:szCs w:val="28"/>
-        </w:rPr>
-        <w:t>OneTime</w:t>
-      </w:r>
-      <w:proofErr w:type="spellEnd"/>
-      <w:r>
-        <w:rPr>
-          <w:color w:val="000000"/>
-          <w:sz w:val="28"/>
-          <w:szCs w:val="28"/>
-        </w:rPr>
-        <w:t xml:space="preserve">. </w:t>
+        <w:t xml:space="preserve">Что такое привязка данных? В чем разница между следующими режимами привязки: OneWay, TwoWay и OneTime. </w:t>
       </w:r>
     </w:p>
     <w:p>
@@ -1122,18 +989,8 @@
           <w:sz w:val="28"/>
           <w:szCs w:val="28"/>
         </w:rPr>
-        <w:t xml:space="preserve"> Объясните назначение интерфейса </w:t>
-      </w:r>
-      <w:proofErr w:type="spellStart"/>
-      <w:r>
-        <w:rPr>
-          <w:color w:val="000000"/>
-          <w:sz w:val="28"/>
-          <w:szCs w:val="28"/>
-        </w:rPr>
-        <w:t>INotifyPropertyChanged</w:t>
-      </w:r>
-      <w:proofErr w:type="spellEnd"/>
+        <w:t xml:space="preserve"> Объясните назначение интерфейса INotifyPropertyChanged</w:t>
+      </w:r>
     </w:p>
     <w:sectPr>
       <w:pgSz w:w="11906" w:h="16838"/>

</xml_diff>